<commit_message>
fix: correct formatting and improve readability in REPORT.docx
</commit_message>
<xml_diff>
--- a/REPORT.docx
+++ b/REPORT.docx
@@ -5,6 +5,10 @@
     <w:p>
       <w:pPr>
         <w:pStyle w:val="Heading1"/>
+        <w:numPr>
+          <w:ilvl w:val="0"/>
+          <w:numId w:val="65"/>
+        </w:numPr>
         <w:rPr>
           <w:b/>
           <w:bCs/>
@@ -14,14 +18,6 @@
           <w:u w:val="thick"/>
         </w:rPr>
       </w:pPr>
-      <w:r>
-        <w:rPr>
-          <w:color w:val="0D0D0D" w:themeColor="text1" w:themeTint="F2"/>
-          <w:sz w:val="72"/>
-          <w:szCs w:val="72"/>
-        </w:rPr>
-        <w:t xml:space="preserve">                  </w:t>
-      </w:r>
       <w:r>
         <w:rPr>
           <w:b/>
@@ -5622,6 +5618,11 @@
     </w:p>
     <w:p>
       <w:pPr>
+        <w:pStyle w:val="ListParagraph"/>
+        <w:numPr>
+          <w:ilvl w:val="0"/>
+          <w:numId w:val="63"/>
+        </w:numPr>
         <w:spacing w:line="240" w:lineRule="auto"/>
       </w:pPr>
       <w:r>
@@ -5630,6 +5631,11 @@
     </w:p>
     <w:p>
       <w:pPr>
+        <w:pStyle w:val="ListParagraph"/>
+        <w:numPr>
+          <w:ilvl w:val="0"/>
+          <w:numId w:val="63"/>
+        </w:numPr>
         <w:spacing w:line="240" w:lineRule="auto"/>
       </w:pPr>
       <w:r>
@@ -5638,6 +5644,11 @@
     </w:p>
     <w:p>
       <w:pPr>
+        <w:pStyle w:val="ListParagraph"/>
+        <w:numPr>
+          <w:ilvl w:val="0"/>
+          <w:numId w:val="63"/>
+        </w:numPr>
         <w:spacing w:line="240" w:lineRule="auto"/>
       </w:pPr>
       <w:r>
@@ -5646,6 +5657,11 @@
     </w:p>
     <w:p>
       <w:pPr>
+        <w:pStyle w:val="ListParagraph"/>
+        <w:numPr>
+          <w:ilvl w:val="0"/>
+          <w:numId w:val="63"/>
+        </w:numPr>
         <w:spacing w:line="240" w:lineRule="auto"/>
       </w:pPr>
       <w:r>
@@ -5654,6 +5670,11 @@
     </w:p>
     <w:p>
       <w:pPr>
+        <w:pStyle w:val="ListParagraph"/>
+        <w:numPr>
+          <w:ilvl w:val="0"/>
+          <w:numId w:val="63"/>
+        </w:numPr>
         <w:spacing w:line="240" w:lineRule="auto"/>
       </w:pPr>
       <w:r>
@@ -5662,6 +5683,11 @@
     </w:p>
     <w:p>
       <w:pPr>
+        <w:pStyle w:val="ListParagraph"/>
+        <w:numPr>
+          <w:ilvl w:val="0"/>
+          <w:numId w:val="63"/>
+        </w:numPr>
         <w:spacing w:line="240" w:lineRule="auto"/>
       </w:pPr>
       <w:r>
@@ -5670,6 +5696,11 @@
     </w:p>
     <w:p>
       <w:pPr>
+        <w:pStyle w:val="ListParagraph"/>
+        <w:numPr>
+          <w:ilvl w:val="0"/>
+          <w:numId w:val="63"/>
+        </w:numPr>
         <w:spacing w:line="240" w:lineRule="auto"/>
       </w:pPr>
       <w:r>
@@ -5678,6 +5709,11 @@
     </w:p>
     <w:p>
       <w:pPr>
+        <w:pStyle w:val="ListParagraph"/>
+        <w:numPr>
+          <w:ilvl w:val="0"/>
+          <w:numId w:val="63"/>
+        </w:numPr>
         <w:spacing w:line="240" w:lineRule="auto"/>
       </w:pPr>
       <w:r>
@@ -5719,58 +5755,93 @@
     </w:p>
     <w:p>
       <w:pPr>
+        <w:pStyle w:val="ListParagraph"/>
+        <w:numPr>
+          <w:ilvl w:val="0"/>
+          <w:numId w:val="64"/>
+        </w:numPr>
         <w:spacing w:line="240" w:lineRule="auto"/>
       </w:pPr>
       <w:r>
+        <w:t>Faster development through modules</w:t>
+      </w:r>
+    </w:p>
+    <w:p>
+      <w:pPr>
+        <w:pStyle w:val="ListParagraph"/>
+        <w:numPr>
+          <w:ilvl w:val="0"/>
+          <w:numId w:val="64"/>
+        </w:numPr>
+        <w:spacing w:line="240" w:lineRule="auto"/>
+      </w:pPr>
+      <w:r>
+        <w:t>Easy requirement changes during project progress</w:t>
+      </w:r>
+    </w:p>
+    <w:p>
+      <w:pPr>
+        <w:pStyle w:val="ListParagraph"/>
+        <w:numPr>
+          <w:ilvl w:val="0"/>
+          <w:numId w:val="64"/>
+        </w:numPr>
+        <w:spacing w:line="240" w:lineRule="auto"/>
+      </w:pPr>
+      <w:r>
+        <w:t>Continuous testing and bug fixing</w:t>
+      </w:r>
+    </w:p>
+    <w:p>
+      <w:pPr>
+        <w:pStyle w:val="ListParagraph"/>
+        <w:numPr>
+          <w:ilvl w:val="0"/>
+          <w:numId w:val="64"/>
+        </w:numPr>
+        <w:spacing w:line="240" w:lineRule="auto"/>
+      </w:pPr>
+      <w:r>
         <w:lastRenderedPageBreak/>
-        <w:t>Faster development through modules</w:t>
-      </w:r>
-    </w:p>
-    <w:p>
-      <w:pPr>
+        <w:t>Better user feedback integration</w:t>
+      </w:r>
+    </w:p>
+    <w:p>
+      <w:pPr>
+        <w:pStyle w:val="ListParagraph"/>
+        <w:numPr>
+          <w:ilvl w:val="0"/>
+          <w:numId w:val="64"/>
+        </w:numPr>
         <w:spacing w:line="240" w:lineRule="auto"/>
       </w:pPr>
       <w:r>
-        <w:t>Easy requirement changes during project progress</w:t>
-      </w:r>
-    </w:p>
-    <w:p>
-      <w:pPr>
+        <w:t>Higher software quality</w:t>
+      </w:r>
+    </w:p>
+    <w:p>
+      <w:pPr>
+        <w:pStyle w:val="ListParagraph"/>
+        <w:numPr>
+          <w:ilvl w:val="0"/>
+          <w:numId w:val="64"/>
+        </w:numPr>
         <w:spacing w:line="240" w:lineRule="auto"/>
       </w:pPr>
       <w:r>
-        <w:t>Continuous testing and bug fixing</w:t>
-      </w:r>
-    </w:p>
-    <w:p>
-      <w:pPr>
+        <w:t>Better risk management</w:t>
+      </w:r>
+    </w:p>
+    <w:p>
+      <w:pPr>
+        <w:pStyle w:val="ListParagraph"/>
+        <w:numPr>
+          <w:ilvl w:val="0"/>
+          <w:numId w:val="64"/>
+        </w:numPr>
         <w:spacing w:line="240" w:lineRule="auto"/>
       </w:pPr>
       <w:r>
-        <w:t>Better user feedback integration</w:t>
-      </w:r>
-    </w:p>
-    <w:p>
-      <w:pPr>
-        <w:spacing w:line="240" w:lineRule="auto"/>
-      </w:pPr>
-      <w:r>
-        <w:t>Higher software quality</w:t>
-      </w:r>
-    </w:p>
-    <w:p>
-      <w:pPr>
-        <w:spacing w:line="240" w:lineRule="auto"/>
-      </w:pPr>
-      <w:r>
-        <w:t>Better risk management</w:t>
-      </w:r>
-    </w:p>
-    <w:p>
-      <w:pPr>
-        <w:spacing w:line="240" w:lineRule="auto"/>
-      </w:pPr>
-      <w:r>
         <w:t>Incremental deployment possible</w:t>
       </w:r>
     </w:p>
@@ -5864,23 +5935,23 @@
     </w:p>
     <w:p>
       <w:r>
+        <w:t>Response flow diagram</w:t>
+      </w:r>
+    </w:p>
+    <w:p>
+      <w:r>
+        <w:t>Navigation structure</w:t>
+      </w:r>
+    </w:p>
+    <w:p>
+      <w:r>
+        <w:t>Prototype screens were also prepared during this stage.</w:t>
+      </w:r>
+    </w:p>
+    <w:p/>
+    <w:p>
+      <w:r>
         <w:lastRenderedPageBreak/>
-        <w:t>Response flow diagram</w:t>
-      </w:r>
-    </w:p>
-    <w:p>
-      <w:r>
-        <w:t>Navigation structure</w:t>
-      </w:r>
-    </w:p>
-    <w:p>
-      <w:r>
-        <w:t>Prototype screens were also prepared during this stage.</w:t>
-      </w:r>
-    </w:p>
-    <w:p/>
-    <w:p>
-      <w:r>
         <w:t>3. Development Sprint</w:t>
       </w:r>
     </w:p>
@@ -5981,23 +6052,23 @@
     </w:p>
     <w:p>
       <w:r>
+        <w:t>User analytics</w:t>
+      </w:r>
+    </w:p>
+    <w:p>
+      <w:r>
+        <w:t>Monitoring reports</w:t>
+      </w:r>
+    </w:p>
+    <w:p>
+      <w:r>
+        <w:t>This modular development improved productivity and reduced risk.</w:t>
+      </w:r>
+    </w:p>
+    <w:p/>
+    <w:p>
+      <w:r>
         <w:lastRenderedPageBreak/>
-        <w:t>User analytics</w:t>
-      </w:r>
-    </w:p>
-    <w:p>
-      <w:r>
-        <w:t>Monitoring reports</w:t>
-      </w:r>
-    </w:p>
-    <w:p>
-      <w:r>
-        <w:t>This modular development improved productivity and reduced risk.</w:t>
-      </w:r>
-    </w:p>
-    <w:p/>
-    <w:p>
-      <w:r>
         <w:t>4. Testing Sprint</w:t>
       </w:r>
     </w:p>
@@ -6105,27 +6176,27 @@
     <w:p/>
     <w:p>
       <w:r>
+        <w:t>For the Spiritual AI Chat Bot, prototype versions were useful in:</w:t>
+      </w:r>
+    </w:p>
+    <w:p>
+      <w:r>
+        <w:t>Chat screen design</w:t>
+      </w:r>
+    </w:p>
+    <w:p>
+      <w:r>
+        <w:t>Message bubble layout</w:t>
+      </w:r>
+    </w:p>
+    <w:p>
+      <w:r>
+        <w:t>Navigation flow</w:t>
+      </w:r>
+    </w:p>
+    <w:p>
+      <w:r>
         <w:lastRenderedPageBreak/>
-        <w:t>For the Spiritual AI Chat Bot, prototype versions were useful in:</w:t>
-      </w:r>
-    </w:p>
-    <w:p>
-      <w:r>
-        <w:t>Chat screen design</w:t>
-      </w:r>
-    </w:p>
-    <w:p>
-      <w:r>
-        <w:t>Message bubble layout</w:t>
-      </w:r>
-    </w:p>
-    <w:p>
-      <w:r>
-        <w:t>Navigation flow</w:t>
-      </w:r>
-    </w:p>
-    <w:p>
-      <w:r>
         <w:t>Voice button placement</w:t>
       </w:r>
     </w:p>
@@ -6223,23 +6294,23 @@
     </w:p>
     <w:p>
       <w:r>
+        <w:t>New features were added safely</w:t>
+      </w:r>
+    </w:p>
+    <w:p>
+      <w:r>
+        <w:t>This makes Agile ideal for dynamic projects like AI chatbot systems.</w:t>
+      </w:r>
+    </w:p>
+    <w:p>
+      <w:r>
+        <w:t>Real Implementation Example in This Project</w:t>
+      </w:r>
+    </w:p>
+    <w:p/>
+    <w:p>
+      <w:r>
         <w:lastRenderedPageBreak/>
-        <w:t>New features were added safely</w:t>
-      </w:r>
-    </w:p>
-    <w:p>
-      <w:r>
-        <w:t>This makes Agile ideal for dynamic projects like AI chatbot systems.</w:t>
-      </w:r>
-    </w:p>
-    <w:p>
-      <w:r>
-        <w:t>Real Implementation Example in This Project</w:t>
-      </w:r>
-    </w:p>
-    <w:p/>
-    <w:p>
-      <w:r>
         <w:t>Module 1: Authentication</w:t>
       </w:r>
     </w:p>
@@ -6332,27 +6403,27 @@
     </w:p>
     <w:p>
       <w:r>
+        <w:t>Continuous improvements</w:t>
+      </w:r>
+    </w:p>
+    <w:p>
+      <w:r>
+        <w:t>High user satisfaction</w:t>
+      </w:r>
+    </w:p>
+    <w:p>
+      <w:r>
+        <w:t>Scalable architecture</w:t>
+      </w:r>
+    </w:p>
+    <w:p>
+      <w:r>
+        <w:t>Better maintainability</w:t>
+      </w:r>
+    </w:p>
+    <w:p>
+      <w:r>
         <w:lastRenderedPageBreak/>
-        <w:t>Continuous improvements</w:t>
-      </w:r>
-    </w:p>
-    <w:p>
-      <w:r>
-        <w:t>High user satisfaction</w:t>
-      </w:r>
-    </w:p>
-    <w:p>
-      <w:r>
-        <w:t>Scalable architecture</w:t>
-      </w:r>
-    </w:p>
-    <w:p>
-      <w:r>
-        <w:t>Better maintainability</w:t>
-      </w:r>
-    </w:p>
-    <w:p>
-      <w:r>
         <w:t>Easier future upgrades</w:t>
       </w:r>
     </w:p>
@@ -6461,6 +6532,28 @@
           <w:bCs/>
           <w:sz w:val="52"/>
           <w:szCs w:val="52"/>
+        </w:rPr>
+      </w:pPr>
+    </w:p>
+    <w:p>
+      <w:pPr>
+        <w:rPr>
+          <w:b/>
+          <w:bCs/>
+          <w:sz w:val="52"/>
+          <w:szCs w:val="52"/>
+          <w:u w:val="thick"/>
+        </w:rPr>
+      </w:pPr>
+    </w:p>
+    <w:p>
+      <w:pPr>
+        <w:rPr>
+          <w:b/>
+          <w:bCs/>
+          <w:sz w:val="52"/>
+          <w:szCs w:val="52"/>
+          <w:u w:val="thick"/>
         </w:rPr>
       </w:pPr>
     </w:p>
@@ -57901,7 +57994,6 @@
         <w:t>11. STANDARD ERROR RESPONSE FORMAT</w:t>
       </w:r>
     </w:p>
-    <w:p/>
     <w:p>
       <w:r>
         <w:t>{</w:t>
@@ -57927,7 +58019,6 @@
         <w:t>}</w:t>
       </w:r>
     </w:p>
-    <w:p/>
     <w:p>
       <w:r>
         <w:t>Benefits:</w:t>
@@ -58010,17 +58101,17 @@
     </w:p>
     <w:p>
       <w:r>
+        <w:t xml:space="preserve">13.2 Sentry (crash tracking)  </w:t>
+      </w:r>
+    </w:p>
+    <w:p>
+      <w:r>
+        <w:t xml:space="preserve">13.3 Postman (API testing)  </w:t>
+      </w:r>
+    </w:p>
+    <w:p>
+      <w:r>
         <w:lastRenderedPageBreak/>
-        <w:t xml:space="preserve">13.2 Sentry (crash tracking)  </w:t>
-      </w:r>
-    </w:p>
-    <w:p>
-      <w:r>
-        <w:t xml:space="preserve">13.3 Postman (API testing)  </w:t>
-      </w:r>
-    </w:p>
-    <w:p>
-      <w:r>
         <w:t xml:space="preserve">13.4 Jest (unit testing)  </w:t>
       </w:r>
     </w:p>
@@ -58127,17 +58218,17 @@
     </w:p>
     <w:p>
       <w:r>
+        <w:t xml:space="preserve">16.2 Auto alert on repeated failures  </w:t>
+      </w:r>
+    </w:p>
+    <w:p>
+      <w:r>
+        <w:t xml:space="preserve">16.3 AI-based anomaly detection  </w:t>
+      </w:r>
+    </w:p>
+    <w:p>
+      <w:r>
         <w:lastRenderedPageBreak/>
-        <w:t xml:space="preserve">16.2 Auto alert on repeated failures  </w:t>
-      </w:r>
-    </w:p>
-    <w:p>
-      <w:r>
-        <w:t xml:space="preserve">16.3 AI-based anomaly detection  </w:t>
-      </w:r>
-    </w:p>
-    <w:p>
-      <w:r>
         <w:t xml:space="preserve">16.4 Better offline recovery mode  </w:t>
       </w:r>
     </w:p>
@@ -58204,6 +58295,16 @@
     <w:p/>
     <w:p/>
     <w:p/>
+    <w:p>
+      <w:pPr>
+        <w:rPr>
+          <w:b/>
+          <w:bCs/>
+          <w:sz w:val="48"/>
+          <w:szCs w:val="48"/>
+        </w:rPr>
+      </w:pPr>
+    </w:p>
     <w:p>
       <w:pPr>
         <w:rPr>
@@ -68196,6 +68297,119 @@
 <file path=word/numbering.xml><?xml version="1.0" encoding="utf-8"?>
 <w:numbering xmlns:wpc="http://schemas.microsoft.com/office/word/2010/wordprocessingCanvas" xmlns:cx="http://schemas.microsoft.com/office/drawing/2014/chartex" xmlns:cx1="http://schemas.microsoft.com/office/drawing/2015/9/8/chartex" xmlns:cx2="http://schemas.microsoft.com/office/drawing/2015/10/21/chartex" xmlns:cx3="http://schemas.microsoft.com/office/drawing/2016/5/9/chartex" xmlns:cx4="http://schemas.microsoft.com/office/drawing/2016/5/10/chartex" xmlns:cx5="http://schemas.microsoft.com/office/drawing/2016/5/11/chartex" xmlns:cx6="http://schemas.microsoft.com/office/drawing/2016/5/12/chartex" xmlns:cx7="http://schemas.microsoft.com/office/drawing/2016/5/13/chartex" xmlns:cx8="http://schemas.microsoft.com/office/drawing/2016/5/14/chartex" xmlns:mc="http://schemas.openxmlformats.org/markup-compatibility/2006" xmlns:aink="http://schemas.microsoft.com/office/drawing/2016/ink" xmlns:am3d="http://schemas.microsoft.com/office/drawing/2017/model3d" xmlns:o="urn:schemas-microsoft-com:office:office" xmlns:oel="http://schemas.microsoft.com/office/2019/extlst" xmlns:r="http://schemas.openxmlformats.org/officeDocument/2006/relationships" xmlns:m="http://schemas.openxmlformats.org/officeDocument/2006/math" xmlns:v="urn:schemas-microsoft-com:vml" xmlns:wp14="http://schemas.microsoft.com/office/word/2010/wordprocessingDrawing" xmlns:wp="http://schemas.openxmlformats.org/drawingml/2006/wordprocessingDrawing" xmlns:w10="urn:schemas-microsoft-com:office:word" xmlns:w="http://schemas.openxmlformats.org/wordprocessingml/2006/main" xmlns:w14="http://schemas.microsoft.com/office/word/2010/wordml" xmlns:w15="http://schemas.microsoft.com/office/word/2012/wordml" xmlns:w16cex="http://schemas.microsoft.com/office/word/2018/wordml/cex" xmlns:w16cid="http://schemas.microsoft.com/office/word/2016/wordml/cid" xmlns:w16="http://schemas.microsoft.com/office/word/2018/wordml" xmlns:w16du="http://schemas.microsoft.com/office/word/2023/wordml/word16du" xmlns:w16sdtdh="http://schemas.microsoft.com/office/word/2020/wordml/sdtdatahash" xmlns:w16sdtfl="http://schemas.microsoft.com/office/word/2024/wordml/sdtformatlock" xmlns:w16se="http://schemas.microsoft.com/office/word/2015/wordml/symex" xmlns:wpg="http://schemas.microsoft.com/office/word/2010/wordprocessingGroup" xmlns:wpi="http://schemas.microsoft.com/office/word/2010/wordprocessingInk" xmlns:wne="http://schemas.microsoft.com/office/word/2006/wordml" xmlns:wps="http://schemas.microsoft.com/office/word/2010/wordprocessingShape" mc:Ignorable="w14 w15 w16se w16cid w16 w16cex w16sdtdh w16sdtfl w16du wp14">
   <w:abstractNum w:abstractNumId="0" w15:restartNumberingAfterBreak="0">
+    <w:nsid w:val="02940E00"/>
+    <w:multiLevelType w:val="hybridMultilevel"/>
+    <w:tmpl w:val="9642E7DA"/>
+    <w:lvl w:ilvl="0" w:tplc="40090001">
+      <w:start w:val="1"/>
+      <w:numFmt w:val="bullet"/>
+      <w:lvlText w:val=""/>
+      <w:lvlJc w:val="left"/>
+      <w:pPr>
+        <w:ind w:left="720" w:hanging="360"/>
+      </w:pPr>
+      <w:rPr>
+        <w:rFonts w:ascii="Symbol" w:hAnsi="Symbol" w:hint="default"/>
+      </w:rPr>
+    </w:lvl>
+    <w:lvl w:ilvl="1" w:tplc="40090003" w:tentative="1">
+      <w:start w:val="1"/>
+      <w:numFmt w:val="bullet"/>
+      <w:lvlText w:val="o"/>
+      <w:lvlJc w:val="left"/>
+      <w:pPr>
+        <w:ind w:left="1440" w:hanging="360"/>
+      </w:pPr>
+      <w:rPr>
+        <w:rFonts w:ascii="Courier New" w:hAnsi="Courier New" w:cs="Courier New" w:hint="default"/>
+      </w:rPr>
+    </w:lvl>
+    <w:lvl w:ilvl="2" w:tplc="40090005" w:tentative="1">
+      <w:start w:val="1"/>
+      <w:numFmt w:val="bullet"/>
+      <w:lvlText w:val=""/>
+      <w:lvlJc w:val="left"/>
+      <w:pPr>
+        <w:ind w:left="2160" w:hanging="360"/>
+      </w:pPr>
+      <w:rPr>
+        <w:rFonts w:ascii="Wingdings" w:hAnsi="Wingdings" w:hint="default"/>
+      </w:rPr>
+    </w:lvl>
+    <w:lvl w:ilvl="3" w:tplc="40090001" w:tentative="1">
+      <w:start w:val="1"/>
+      <w:numFmt w:val="bullet"/>
+      <w:lvlText w:val=""/>
+      <w:lvlJc w:val="left"/>
+      <w:pPr>
+        <w:ind w:left="2880" w:hanging="360"/>
+      </w:pPr>
+      <w:rPr>
+        <w:rFonts w:ascii="Symbol" w:hAnsi="Symbol" w:hint="default"/>
+      </w:rPr>
+    </w:lvl>
+    <w:lvl w:ilvl="4" w:tplc="40090003" w:tentative="1">
+      <w:start w:val="1"/>
+      <w:numFmt w:val="bullet"/>
+      <w:lvlText w:val="o"/>
+      <w:lvlJc w:val="left"/>
+      <w:pPr>
+        <w:ind w:left="3600" w:hanging="360"/>
+      </w:pPr>
+      <w:rPr>
+        <w:rFonts w:ascii="Courier New" w:hAnsi="Courier New" w:cs="Courier New" w:hint="default"/>
+      </w:rPr>
+    </w:lvl>
+    <w:lvl w:ilvl="5" w:tplc="40090005" w:tentative="1">
+      <w:start w:val="1"/>
+      <w:numFmt w:val="bullet"/>
+      <w:lvlText w:val=""/>
+      <w:lvlJc w:val="left"/>
+      <w:pPr>
+        <w:ind w:left="4320" w:hanging="360"/>
+      </w:pPr>
+      <w:rPr>
+        <w:rFonts w:ascii="Wingdings" w:hAnsi="Wingdings" w:hint="default"/>
+      </w:rPr>
+    </w:lvl>
+    <w:lvl w:ilvl="6" w:tplc="40090001" w:tentative="1">
+      <w:start w:val="1"/>
+      <w:numFmt w:val="bullet"/>
+      <w:lvlText w:val=""/>
+      <w:lvlJc w:val="left"/>
+      <w:pPr>
+        <w:ind w:left="5040" w:hanging="360"/>
+      </w:pPr>
+      <w:rPr>
+        <w:rFonts w:ascii="Symbol" w:hAnsi="Symbol" w:hint="default"/>
+      </w:rPr>
+    </w:lvl>
+    <w:lvl w:ilvl="7" w:tplc="40090003" w:tentative="1">
+      <w:start w:val="1"/>
+      <w:numFmt w:val="bullet"/>
+      <w:lvlText w:val="o"/>
+      <w:lvlJc w:val="left"/>
+      <w:pPr>
+        <w:ind w:left="5760" w:hanging="360"/>
+      </w:pPr>
+      <w:rPr>
+        <w:rFonts w:ascii="Courier New" w:hAnsi="Courier New" w:cs="Courier New" w:hint="default"/>
+      </w:rPr>
+    </w:lvl>
+    <w:lvl w:ilvl="8" w:tplc="40090005" w:tentative="1">
+      <w:start w:val="1"/>
+      <w:numFmt w:val="bullet"/>
+      <w:lvlText w:val=""/>
+      <w:lvlJc w:val="left"/>
+      <w:pPr>
+        <w:ind w:left="6480" w:hanging="360"/>
+      </w:pPr>
+      <w:rPr>
+        <w:rFonts w:ascii="Wingdings" w:hAnsi="Wingdings" w:hint="default"/>
+      </w:rPr>
+    </w:lvl>
+  </w:abstractNum>
+  <w:abstractNum w:abstractNumId="1" w15:restartNumberingAfterBreak="0">
     <w:nsid w:val="037004C6"/>
     <w:multiLevelType w:val="multilevel"/>
     <w:tmpl w:val="A2285E28"/>
@@ -68344,7 +68558,7 @@
       </w:rPr>
     </w:lvl>
   </w:abstractNum>
-  <w:abstractNum w:abstractNumId="1" w15:restartNumberingAfterBreak="0">
+  <w:abstractNum w:abstractNumId="2" w15:restartNumberingAfterBreak="0">
     <w:nsid w:val="050E077C"/>
     <w:multiLevelType w:val="multilevel"/>
     <w:tmpl w:val="A69AE0FA"/>
@@ -68493,7 +68707,7 @@
       </w:rPr>
     </w:lvl>
   </w:abstractNum>
-  <w:abstractNum w:abstractNumId="2" w15:restartNumberingAfterBreak="0">
+  <w:abstractNum w:abstractNumId="3" w15:restartNumberingAfterBreak="0">
     <w:nsid w:val="0531596E"/>
     <w:multiLevelType w:val="multilevel"/>
     <w:tmpl w:val="5750FC48"/>
@@ -68642,7 +68856,7 @@
       </w:rPr>
     </w:lvl>
   </w:abstractNum>
-  <w:abstractNum w:abstractNumId="3" w15:restartNumberingAfterBreak="0">
+  <w:abstractNum w:abstractNumId="4" w15:restartNumberingAfterBreak="0">
     <w:nsid w:val="053F0075"/>
     <w:multiLevelType w:val="multilevel"/>
     <w:tmpl w:val="4C1A0FC6"/>
@@ -68791,7 +69005,7 @@
       </w:rPr>
     </w:lvl>
   </w:abstractNum>
-  <w:abstractNum w:abstractNumId="4" w15:restartNumberingAfterBreak="0">
+  <w:abstractNum w:abstractNumId="5" w15:restartNumberingAfterBreak="0">
     <w:nsid w:val="09675B28"/>
     <w:multiLevelType w:val="multilevel"/>
     <w:tmpl w:val="91A4B89A"/>
@@ -68940,7 +69154,7 @@
       </w:rPr>
     </w:lvl>
   </w:abstractNum>
-  <w:abstractNum w:abstractNumId="5" w15:restartNumberingAfterBreak="0">
+  <w:abstractNum w:abstractNumId="6" w15:restartNumberingAfterBreak="0">
     <w:nsid w:val="0C37443C"/>
     <w:multiLevelType w:val="multilevel"/>
     <w:tmpl w:val="F0BAD226"/>
@@ -69089,7 +69303,7 @@
       </w:rPr>
     </w:lvl>
   </w:abstractNum>
-  <w:abstractNum w:abstractNumId="6" w15:restartNumberingAfterBreak="0">
+  <w:abstractNum w:abstractNumId="7" w15:restartNumberingAfterBreak="0">
     <w:nsid w:val="0E12035C"/>
     <w:multiLevelType w:val="multilevel"/>
     <w:tmpl w:val="314EFC50"/>
@@ -69238,7 +69452,7 @@
       </w:rPr>
     </w:lvl>
   </w:abstractNum>
-  <w:abstractNum w:abstractNumId="7" w15:restartNumberingAfterBreak="0">
+  <w:abstractNum w:abstractNumId="8" w15:restartNumberingAfterBreak="0">
     <w:nsid w:val="0E8B25CA"/>
     <w:multiLevelType w:val="multilevel"/>
     <w:tmpl w:val="FB766108"/>
@@ -69387,7 +69601,7 @@
       </w:rPr>
     </w:lvl>
   </w:abstractNum>
-  <w:abstractNum w:abstractNumId="8" w15:restartNumberingAfterBreak="0">
+  <w:abstractNum w:abstractNumId="9" w15:restartNumberingAfterBreak="0">
     <w:nsid w:val="104C5A4C"/>
     <w:multiLevelType w:val="multilevel"/>
     <w:tmpl w:val="A8AAFC5A"/>
@@ -69536,7 +69750,7 @@
       </w:rPr>
     </w:lvl>
   </w:abstractNum>
-  <w:abstractNum w:abstractNumId="9" w15:restartNumberingAfterBreak="0">
+  <w:abstractNum w:abstractNumId="10" w15:restartNumberingAfterBreak="0">
     <w:nsid w:val="116910DF"/>
     <w:multiLevelType w:val="multilevel"/>
     <w:tmpl w:val="2886EB36"/>
@@ -69678,7 +69892,7 @@
       </w:rPr>
     </w:lvl>
   </w:abstractNum>
-  <w:abstractNum w:abstractNumId="10" w15:restartNumberingAfterBreak="0">
+  <w:abstractNum w:abstractNumId="11" w15:restartNumberingAfterBreak="0">
     <w:nsid w:val="12754D29"/>
     <w:multiLevelType w:val="multilevel"/>
     <w:tmpl w:val="B3706E22"/>
@@ -69827,7 +70041,7 @@
       </w:rPr>
     </w:lvl>
   </w:abstractNum>
-  <w:abstractNum w:abstractNumId="11" w15:restartNumberingAfterBreak="0">
+  <w:abstractNum w:abstractNumId="12" w15:restartNumberingAfterBreak="0">
     <w:nsid w:val="16C8342D"/>
     <w:multiLevelType w:val="multilevel"/>
     <w:tmpl w:val="BAE20ECE"/>
@@ -69976,7 +70190,7 @@
       </w:rPr>
     </w:lvl>
   </w:abstractNum>
-  <w:abstractNum w:abstractNumId="12" w15:restartNumberingAfterBreak="0">
+  <w:abstractNum w:abstractNumId="13" w15:restartNumberingAfterBreak="0">
     <w:nsid w:val="18470EDB"/>
     <w:multiLevelType w:val="multilevel"/>
     <w:tmpl w:val="38D47A22"/>
@@ -70125,7 +70339,7 @@
       </w:rPr>
     </w:lvl>
   </w:abstractNum>
-  <w:abstractNum w:abstractNumId="13" w15:restartNumberingAfterBreak="0">
+  <w:abstractNum w:abstractNumId="14" w15:restartNumberingAfterBreak="0">
     <w:nsid w:val="1B430D68"/>
     <w:multiLevelType w:val="multilevel"/>
     <w:tmpl w:val="E948036E"/>
@@ -70274,7 +70488,7 @@
       </w:rPr>
     </w:lvl>
   </w:abstractNum>
-  <w:abstractNum w:abstractNumId="14" w15:restartNumberingAfterBreak="0">
+  <w:abstractNum w:abstractNumId="15" w15:restartNumberingAfterBreak="0">
     <w:nsid w:val="1BFF352A"/>
     <w:multiLevelType w:val="multilevel"/>
     <w:tmpl w:val="7FC8A554"/>
@@ -70423,7 +70637,7 @@
       </w:rPr>
     </w:lvl>
   </w:abstractNum>
-  <w:abstractNum w:abstractNumId="15" w15:restartNumberingAfterBreak="0">
+  <w:abstractNum w:abstractNumId="16" w15:restartNumberingAfterBreak="0">
     <w:nsid w:val="1C117AB5"/>
     <w:multiLevelType w:val="multilevel"/>
     <w:tmpl w:val="95A6AF4C"/>
@@ -70572,7 +70786,7 @@
       </w:rPr>
     </w:lvl>
   </w:abstractNum>
-  <w:abstractNum w:abstractNumId="16" w15:restartNumberingAfterBreak="0">
+  <w:abstractNum w:abstractNumId="17" w15:restartNumberingAfterBreak="0">
     <w:nsid w:val="1E820860"/>
     <w:multiLevelType w:val="multilevel"/>
     <w:tmpl w:val="EE3614D6"/>
@@ -70721,7 +70935,7 @@
       </w:rPr>
     </w:lvl>
   </w:abstractNum>
-  <w:abstractNum w:abstractNumId="17" w15:restartNumberingAfterBreak="0">
+  <w:abstractNum w:abstractNumId="18" w15:restartNumberingAfterBreak="0">
     <w:nsid w:val="1F5069C1"/>
     <w:multiLevelType w:val="multilevel"/>
     <w:tmpl w:val="DEF03758"/>
@@ -70870,7 +71084,7 @@
       </w:rPr>
     </w:lvl>
   </w:abstractNum>
-  <w:abstractNum w:abstractNumId="18" w15:restartNumberingAfterBreak="0">
+  <w:abstractNum w:abstractNumId="19" w15:restartNumberingAfterBreak="0">
     <w:nsid w:val="1F5256A2"/>
     <w:multiLevelType w:val="multilevel"/>
     <w:tmpl w:val="BD947352"/>
@@ -71019,7 +71233,7 @@
       </w:rPr>
     </w:lvl>
   </w:abstractNum>
-  <w:abstractNum w:abstractNumId="19" w15:restartNumberingAfterBreak="0">
+  <w:abstractNum w:abstractNumId="20" w15:restartNumberingAfterBreak="0">
     <w:nsid w:val="20453A93"/>
     <w:multiLevelType w:val="multilevel"/>
     <w:tmpl w:val="967C88BE"/>
@@ -71168,7 +71382,7 @@
       </w:rPr>
     </w:lvl>
   </w:abstractNum>
-  <w:abstractNum w:abstractNumId="20" w15:restartNumberingAfterBreak="0">
+  <w:abstractNum w:abstractNumId="21" w15:restartNumberingAfterBreak="0">
     <w:nsid w:val="222F1E5D"/>
     <w:multiLevelType w:val="multilevel"/>
     <w:tmpl w:val="FD0660C8"/>
@@ -71317,7 +71531,7 @@
       </w:rPr>
     </w:lvl>
   </w:abstractNum>
-  <w:abstractNum w:abstractNumId="21" w15:restartNumberingAfterBreak="0">
+  <w:abstractNum w:abstractNumId="22" w15:restartNumberingAfterBreak="0">
     <w:nsid w:val="23301047"/>
     <w:multiLevelType w:val="multilevel"/>
     <w:tmpl w:val="5FBAF626"/>
@@ -71466,7 +71680,7 @@
       </w:rPr>
     </w:lvl>
   </w:abstractNum>
-  <w:abstractNum w:abstractNumId="22" w15:restartNumberingAfterBreak="0">
+  <w:abstractNum w:abstractNumId="23" w15:restartNumberingAfterBreak="0">
     <w:nsid w:val="2BD005EC"/>
     <w:multiLevelType w:val="multilevel"/>
     <w:tmpl w:val="A1C22282"/>
@@ -71615,7 +71829,7 @@
       </w:rPr>
     </w:lvl>
   </w:abstractNum>
-  <w:abstractNum w:abstractNumId="23" w15:restartNumberingAfterBreak="0">
+  <w:abstractNum w:abstractNumId="24" w15:restartNumberingAfterBreak="0">
     <w:nsid w:val="2C57309F"/>
     <w:multiLevelType w:val="multilevel"/>
     <w:tmpl w:val="F9D29F58"/>
@@ -71764,7 +71978,98 @@
       </w:rPr>
     </w:lvl>
   </w:abstractNum>
-  <w:abstractNum w:abstractNumId="24" w15:restartNumberingAfterBreak="0">
+  <w:abstractNum w:abstractNumId="25" w15:restartNumberingAfterBreak="0">
+    <w:nsid w:val="2E7204B5"/>
+    <w:multiLevelType w:val="hybridMultilevel"/>
+    <w:tmpl w:val="2340975C"/>
+    <w:lvl w:ilvl="0" w:tplc="84E6E52A">
+      <w:start w:val="1"/>
+      <w:numFmt w:val="decimal"/>
+      <w:lvlText w:val="%1."/>
+      <w:lvlJc w:val="left"/>
+      <w:pPr>
+        <w:ind w:left="3216" w:hanging="720"/>
+      </w:pPr>
+      <w:rPr>
+        <w:rFonts w:hint="default"/>
+        <w:b w:val="0"/>
+        <w:u w:val="none"/>
+      </w:rPr>
+    </w:lvl>
+    <w:lvl w:ilvl="1" w:tplc="40090019" w:tentative="1">
+      <w:start w:val="1"/>
+      <w:numFmt w:val="lowerLetter"/>
+      <w:lvlText w:val="%2."/>
+      <w:lvlJc w:val="left"/>
+      <w:pPr>
+        <w:ind w:left="3576" w:hanging="360"/>
+      </w:pPr>
+    </w:lvl>
+    <w:lvl w:ilvl="2" w:tplc="4009001B" w:tentative="1">
+      <w:start w:val="1"/>
+      <w:numFmt w:val="lowerRoman"/>
+      <w:lvlText w:val="%3."/>
+      <w:lvlJc w:val="right"/>
+      <w:pPr>
+        <w:ind w:left="4296" w:hanging="180"/>
+      </w:pPr>
+    </w:lvl>
+    <w:lvl w:ilvl="3" w:tplc="4009000F" w:tentative="1">
+      <w:start w:val="1"/>
+      <w:numFmt w:val="decimal"/>
+      <w:lvlText w:val="%4."/>
+      <w:lvlJc w:val="left"/>
+      <w:pPr>
+        <w:ind w:left="5016" w:hanging="360"/>
+      </w:pPr>
+    </w:lvl>
+    <w:lvl w:ilvl="4" w:tplc="40090019" w:tentative="1">
+      <w:start w:val="1"/>
+      <w:numFmt w:val="lowerLetter"/>
+      <w:lvlText w:val="%5."/>
+      <w:lvlJc w:val="left"/>
+      <w:pPr>
+        <w:ind w:left="5736" w:hanging="360"/>
+      </w:pPr>
+    </w:lvl>
+    <w:lvl w:ilvl="5" w:tplc="4009001B" w:tentative="1">
+      <w:start w:val="1"/>
+      <w:numFmt w:val="lowerRoman"/>
+      <w:lvlText w:val="%6."/>
+      <w:lvlJc w:val="right"/>
+      <w:pPr>
+        <w:ind w:left="6456" w:hanging="180"/>
+      </w:pPr>
+    </w:lvl>
+    <w:lvl w:ilvl="6" w:tplc="4009000F" w:tentative="1">
+      <w:start w:val="1"/>
+      <w:numFmt w:val="decimal"/>
+      <w:lvlText w:val="%7."/>
+      <w:lvlJc w:val="left"/>
+      <w:pPr>
+        <w:ind w:left="7176" w:hanging="360"/>
+      </w:pPr>
+    </w:lvl>
+    <w:lvl w:ilvl="7" w:tplc="40090019" w:tentative="1">
+      <w:start w:val="1"/>
+      <w:numFmt w:val="lowerLetter"/>
+      <w:lvlText w:val="%8."/>
+      <w:lvlJc w:val="left"/>
+      <w:pPr>
+        <w:ind w:left="7896" w:hanging="360"/>
+      </w:pPr>
+    </w:lvl>
+    <w:lvl w:ilvl="8" w:tplc="4009001B" w:tentative="1">
+      <w:start w:val="1"/>
+      <w:numFmt w:val="lowerRoman"/>
+      <w:lvlText w:val="%9."/>
+      <w:lvlJc w:val="right"/>
+      <w:pPr>
+        <w:ind w:left="8616" w:hanging="180"/>
+      </w:pPr>
+    </w:lvl>
+  </w:abstractNum>
+  <w:abstractNum w:abstractNumId="26" w15:restartNumberingAfterBreak="0">
     <w:nsid w:val="2F674ACA"/>
     <w:multiLevelType w:val="multilevel"/>
     <w:tmpl w:val="F59AA76C"/>
@@ -71913,7 +72218,7 @@
       </w:rPr>
     </w:lvl>
   </w:abstractNum>
-  <w:abstractNum w:abstractNumId="25" w15:restartNumberingAfterBreak="0">
+  <w:abstractNum w:abstractNumId="27" w15:restartNumberingAfterBreak="0">
     <w:nsid w:val="30E62001"/>
     <w:multiLevelType w:val="multilevel"/>
     <w:tmpl w:val="198A2EAA"/>
@@ -72062,7 +72367,7 @@
       </w:rPr>
     </w:lvl>
   </w:abstractNum>
-  <w:abstractNum w:abstractNumId="26" w15:restartNumberingAfterBreak="0">
+  <w:abstractNum w:abstractNumId="28" w15:restartNumberingAfterBreak="0">
     <w:nsid w:val="324F3579"/>
     <w:multiLevelType w:val="hybridMultilevel"/>
     <w:tmpl w:val="47BEBBBA"/>
@@ -72175,7 +72480,7 @@
       </w:rPr>
     </w:lvl>
   </w:abstractNum>
-  <w:abstractNum w:abstractNumId="27" w15:restartNumberingAfterBreak="0">
+  <w:abstractNum w:abstractNumId="29" w15:restartNumberingAfterBreak="0">
     <w:nsid w:val="326A4573"/>
     <w:multiLevelType w:val="multilevel"/>
     <w:tmpl w:val="41527268"/>
@@ -72324,7 +72629,7 @@
       </w:rPr>
     </w:lvl>
   </w:abstractNum>
-  <w:abstractNum w:abstractNumId="28" w15:restartNumberingAfterBreak="0">
+  <w:abstractNum w:abstractNumId="30" w15:restartNumberingAfterBreak="0">
     <w:nsid w:val="34404BA6"/>
     <w:multiLevelType w:val="multilevel"/>
     <w:tmpl w:val="CE682C20"/>
@@ -72473,7 +72778,7 @@
       </w:rPr>
     </w:lvl>
   </w:abstractNum>
-  <w:abstractNum w:abstractNumId="29" w15:restartNumberingAfterBreak="0">
+  <w:abstractNum w:abstractNumId="31" w15:restartNumberingAfterBreak="0">
     <w:nsid w:val="379C2D5F"/>
     <w:multiLevelType w:val="multilevel"/>
     <w:tmpl w:val="9536CFE2"/>
@@ -72622,7 +72927,7 @@
       </w:rPr>
     </w:lvl>
   </w:abstractNum>
-  <w:abstractNum w:abstractNumId="30" w15:restartNumberingAfterBreak="0">
+  <w:abstractNum w:abstractNumId="32" w15:restartNumberingAfterBreak="0">
     <w:nsid w:val="383505FC"/>
     <w:multiLevelType w:val="multilevel"/>
     <w:tmpl w:val="796226D0"/>
@@ -72771,7 +73076,7 @@
       </w:rPr>
     </w:lvl>
   </w:abstractNum>
-  <w:abstractNum w:abstractNumId="31" w15:restartNumberingAfterBreak="0">
+  <w:abstractNum w:abstractNumId="33" w15:restartNumberingAfterBreak="0">
     <w:nsid w:val="3B254464"/>
     <w:multiLevelType w:val="multilevel"/>
     <w:tmpl w:val="D44641F0"/>
@@ -72920,7 +73225,7 @@
       </w:rPr>
     </w:lvl>
   </w:abstractNum>
-  <w:abstractNum w:abstractNumId="32" w15:restartNumberingAfterBreak="0">
+  <w:abstractNum w:abstractNumId="34" w15:restartNumberingAfterBreak="0">
     <w:nsid w:val="3D331EC0"/>
     <w:multiLevelType w:val="multilevel"/>
     <w:tmpl w:val="BFEC3A2C"/>
@@ -73069,7 +73374,7 @@
       </w:rPr>
     </w:lvl>
   </w:abstractNum>
-  <w:abstractNum w:abstractNumId="33" w15:restartNumberingAfterBreak="0">
+  <w:abstractNum w:abstractNumId="35" w15:restartNumberingAfterBreak="0">
     <w:nsid w:val="3F752706"/>
     <w:multiLevelType w:val="multilevel"/>
     <w:tmpl w:val="B5C01FE8"/>
@@ -73218,7 +73523,7 @@
       </w:rPr>
     </w:lvl>
   </w:abstractNum>
-  <w:abstractNum w:abstractNumId="34" w15:restartNumberingAfterBreak="0">
+  <w:abstractNum w:abstractNumId="36" w15:restartNumberingAfterBreak="0">
     <w:nsid w:val="40274D10"/>
     <w:multiLevelType w:val="multilevel"/>
     <w:tmpl w:val="68DADC8A"/>
@@ -73367,7 +73672,7 @@
       </w:rPr>
     </w:lvl>
   </w:abstractNum>
-  <w:abstractNum w:abstractNumId="35" w15:restartNumberingAfterBreak="0">
+  <w:abstractNum w:abstractNumId="37" w15:restartNumberingAfterBreak="0">
     <w:nsid w:val="45493487"/>
     <w:multiLevelType w:val="hybridMultilevel"/>
     <w:tmpl w:val="AF3C1D9A"/>
@@ -73483,7 +73788,7 @@
       </w:rPr>
     </w:lvl>
   </w:abstractNum>
-  <w:abstractNum w:abstractNumId="36" w15:restartNumberingAfterBreak="0">
+  <w:abstractNum w:abstractNumId="38" w15:restartNumberingAfterBreak="0">
     <w:nsid w:val="488150AF"/>
     <w:multiLevelType w:val="multilevel"/>
     <w:tmpl w:val="36000616"/>
@@ -73632,7 +73937,7 @@
       </w:rPr>
     </w:lvl>
   </w:abstractNum>
-  <w:abstractNum w:abstractNumId="37" w15:restartNumberingAfterBreak="0">
+  <w:abstractNum w:abstractNumId="39" w15:restartNumberingAfterBreak="0">
     <w:nsid w:val="4CFC2D11"/>
     <w:multiLevelType w:val="hybridMultilevel"/>
     <w:tmpl w:val="64D0E8B6"/>
@@ -73748,7 +74053,7 @@
       </w:rPr>
     </w:lvl>
   </w:abstractNum>
-  <w:abstractNum w:abstractNumId="38" w15:restartNumberingAfterBreak="0">
+  <w:abstractNum w:abstractNumId="40" w15:restartNumberingAfterBreak="0">
     <w:nsid w:val="4FCE5C12"/>
     <w:multiLevelType w:val="multilevel"/>
     <w:tmpl w:val="CC36E196"/>
@@ -73897,7 +74202,7 @@
       </w:rPr>
     </w:lvl>
   </w:abstractNum>
-  <w:abstractNum w:abstractNumId="39" w15:restartNumberingAfterBreak="0">
+  <w:abstractNum w:abstractNumId="41" w15:restartNumberingAfterBreak="0">
     <w:nsid w:val="504D63E0"/>
     <w:multiLevelType w:val="multilevel"/>
     <w:tmpl w:val="BD5AA74E"/>
@@ -74046,7 +74351,120 @@
       </w:rPr>
     </w:lvl>
   </w:abstractNum>
-  <w:abstractNum w:abstractNumId="40" w15:restartNumberingAfterBreak="0">
+  <w:abstractNum w:abstractNumId="42" w15:restartNumberingAfterBreak="0">
+    <w:nsid w:val="54243485"/>
+    <w:multiLevelType w:val="hybridMultilevel"/>
+    <w:tmpl w:val="32A410DC"/>
+    <w:lvl w:ilvl="0" w:tplc="40090001">
+      <w:start w:val="1"/>
+      <w:numFmt w:val="bullet"/>
+      <w:lvlText w:val=""/>
+      <w:lvlJc w:val="left"/>
+      <w:pPr>
+        <w:ind w:left="720" w:hanging="360"/>
+      </w:pPr>
+      <w:rPr>
+        <w:rFonts w:ascii="Symbol" w:hAnsi="Symbol" w:hint="default"/>
+      </w:rPr>
+    </w:lvl>
+    <w:lvl w:ilvl="1" w:tplc="40090003" w:tentative="1">
+      <w:start w:val="1"/>
+      <w:numFmt w:val="bullet"/>
+      <w:lvlText w:val="o"/>
+      <w:lvlJc w:val="left"/>
+      <w:pPr>
+        <w:ind w:left="1440" w:hanging="360"/>
+      </w:pPr>
+      <w:rPr>
+        <w:rFonts w:ascii="Courier New" w:hAnsi="Courier New" w:cs="Courier New" w:hint="default"/>
+      </w:rPr>
+    </w:lvl>
+    <w:lvl w:ilvl="2" w:tplc="40090005" w:tentative="1">
+      <w:start w:val="1"/>
+      <w:numFmt w:val="bullet"/>
+      <w:lvlText w:val=""/>
+      <w:lvlJc w:val="left"/>
+      <w:pPr>
+        <w:ind w:left="2160" w:hanging="360"/>
+      </w:pPr>
+      <w:rPr>
+        <w:rFonts w:ascii="Wingdings" w:hAnsi="Wingdings" w:hint="default"/>
+      </w:rPr>
+    </w:lvl>
+    <w:lvl w:ilvl="3" w:tplc="40090001" w:tentative="1">
+      <w:start w:val="1"/>
+      <w:numFmt w:val="bullet"/>
+      <w:lvlText w:val=""/>
+      <w:lvlJc w:val="left"/>
+      <w:pPr>
+        <w:ind w:left="2880" w:hanging="360"/>
+      </w:pPr>
+      <w:rPr>
+        <w:rFonts w:ascii="Symbol" w:hAnsi="Symbol" w:hint="default"/>
+      </w:rPr>
+    </w:lvl>
+    <w:lvl w:ilvl="4" w:tplc="40090003" w:tentative="1">
+      <w:start w:val="1"/>
+      <w:numFmt w:val="bullet"/>
+      <w:lvlText w:val="o"/>
+      <w:lvlJc w:val="left"/>
+      <w:pPr>
+        <w:ind w:left="3600" w:hanging="360"/>
+      </w:pPr>
+      <w:rPr>
+        <w:rFonts w:ascii="Courier New" w:hAnsi="Courier New" w:cs="Courier New" w:hint="default"/>
+      </w:rPr>
+    </w:lvl>
+    <w:lvl w:ilvl="5" w:tplc="40090005" w:tentative="1">
+      <w:start w:val="1"/>
+      <w:numFmt w:val="bullet"/>
+      <w:lvlText w:val=""/>
+      <w:lvlJc w:val="left"/>
+      <w:pPr>
+        <w:ind w:left="4320" w:hanging="360"/>
+      </w:pPr>
+      <w:rPr>
+        <w:rFonts w:ascii="Wingdings" w:hAnsi="Wingdings" w:hint="default"/>
+      </w:rPr>
+    </w:lvl>
+    <w:lvl w:ilvl="6" w:tplc="40090001" w:tentative="1">
+      <w:start w:val="1"/>
+      <w:numFmt w:val="bullet"/>
+      <w:lvlText w:val=""/>
+      <w:lvlJc w:val="left"/>
+      <w:pPr>
+        <w:ind w:left="5040" w:hanging="360"/>
+      </w:pPr>
+      <w:rPr>
+        <w:rFonts w:ascii="Symbol" w:hAnsi="Symbol" w:hint="default"/>
+      </w:rPr>
+    </w:lvl>
+    <w:lvl w:ilvl="7" w:tplc="40090003" w:tentative="1">
+      <w:start w:val="1"/>
+      <w:numFmt w:val="bullet"/>
+      <w:lvlText w:val="o"/>
+      <w:lvlJc w:val="left"/>
+      <w:pPr>
+        <w:ind w:left="5760" w:hanging="360"/>
+      </w:pPr>
+      <w:rPr>
+        <w:rFonts w:ascii="Courier New" w:hAnsi="Courier New" w:cs="Courier New" w:hint="default"/>
+      </w:rPr>
+    </w:lvl>
+    <w:lvl w:ilvl="8" w:tplc="40090005" w:tentative="1">
+      <w:start w:val="1"/>
+      <w:numFmt w:val="bullet"/>
+      <w:lvlText w:val=""/>
+      <w:lvlJc w:val="left"/>
+      <w:pPr>
+        <w:ind w:left="6480" w:hanging="360"/>
+      </w:pPr>
+      <w:rPr>
+        <w:rFonts w:ascii="Wingdings" w:hAnsi="Wingdings" w:hint="default"/>
+      </w:rPr>
+    </w:lvl>
+  </w:abstractNum>
+  <w:abstractNum w:abstractNumId="43" w15:restartNumberingAfterBreak="0">
     <w:nsid w:val="54395A01"/>
     <w:multiLevelType w:val="multilevel"/>
     <w:tmpl w:val="570E3C46"/>
@@ -74195,7 +74613,7 @@
       </w:rPr>
     </w:lvl>
   </w:abstractNum>
-  <w:abstractNum w:abstractNumId="41" w15:restartNumberingAfterBreak="0">
+  <w:abstractNum w:abstractNumId="44" w15:restartNumberingAfterBreak="0">
     <w:nsid w:val="55876E89"/>
     <w:multiLevelType w:val="multilevel"/>
     <w:tmpl w:val="AA841D6E"/>
@@ -74344,7 +74762,7 @@
       </w:rPr>
     </w:lvl>
   </w:abstractNum>
-  <w:abstractNum w:abstractNumId="42" w15:restartNumberingAfterBreak="0">
+  <w:abstractNum w:abstractNumId="45" w15:restartNumberingAfterBreak="0">
     <w:nsid w:val="56A95E2E"/>
     <w:multiLevelType w:val="multilevel"/>
     <w:tmpl w:val="86166D50"/>
@@ -74493,7 +74911,7 @@
       </w:rPr>
     </w:lvl>
   </w:abstractNum>
-  <w:abstractNum w:abstractNumId="43" w15:restartNumberingAfterBreak="0">
+  <w:abstractNum w:abstractNumId="46" w15:restartNumberingAfterBreak="0">
     <w:nsid w:val="5AF36055"/>
     <w:multiLevelType w:val="multilevel"/>
     <w:tmpl w:val="C1E85A12"/>
@@ -74642,7 +75060,7 @@
       </w:rPr>
     </w:lvl>
   </w:abstractNum>
-  <w:abstractNum w:abstractNumId="44" w15:restartNumberingAfterBreak="0">
+  <w:abstractNum w:abstractNumId="47" w15:restartNumberingAfterBreak="0">
     <w:nsid w:val="5BF92FD3"/>
     <w:multiLevelType w:val="multilevel"/>
     <w:tmpl w:val="E0DE329A"/>
@@ -74791,7 +75209,7 @@
       </w:rPr>
     </w:lvl>
   </w:abstractNum>
-  <w:abstractNum w:abstractNumId="45" w15:restartNumberingAfterBreak="0">
+  <w:abstractNum w:abstractNumId="48" w15:restartNumberingAfterBreak="0">
     <w:nsid w:val="5C1438F3"/>
     <w:multiLevelType w:val="multilevel"/>
     <w:tmpl w:val="F72ABAF6"/>
@@ -74940,7 +75358,7 @@
       </w:rPr>
     </w:lvl>
   </w:abstractNum>
-  <w:abstractNum w:abstractNumId="46" w15:restartNumberingAfterBreak="0">
+  <w:abstractNum w:abstractNumId="49" w15:restartNumberingAfterBreak="0">
     <w:nsid w:val="5EE3004B"/>
     <w:multiLevelType w:val="multilevel"/>
     <w:tmpl w:val="FAC4BEF8"/>
@@ -75089,7 +75507,7 @@
       </w:rPr>
     </w:lvl>
   </w:abstractNum>
-  <w:abstractNum w:abstractNumId="47" w15:restartNumberingAfterBreak="0">
+  <w:abstractNum w:abstractNumId="50" w15:restartNumberingAfterBreak="0">
     <w:nsid w:val="62B0387B"/>
     <w:multiLevelType w:val="multilevel"/>
     <w:tmpl w:val="F38A78F2"/>
@@ -75238,7 +75656,7 @@
       </w:rPr>
     </w:lvl>
   </w:abstractNum>
-  <w:abstractNum w:abstractNumId="48" w15:restartNumberingAfterBreak="0">
+  <w:abstractNum w:abstractNumId="51" w15:restartNumberingAfterBreak="0">
     <w:nsid w:val="63D00051"/>
     <w:multiLevelType w:val="multilevel"/>
     <w:tmpl w:val="A274AF7A"/>
@@ -75387,7 +75805,7 @@
       </w:rPr>
     </w:lvl>
   </w:abstractNum>
-  <w:abstractNum w:abstractNumId="49" w15:restartNumberingAfterBreak="0">
+  <w:abstractNum w:abstractNumId="52" w15:restartNumberingAfterBreak="0">
     <w:nsid w:val="65054928"/>
     <w:multiLevelType w:val="multilevel"/>
     <w:tmpl w:val="7CC88C78"/>
@@ -75536,7 +75954,7 @@
       </w:rPr>
     </w:lvl>
   </w:abstractNum>
-  <w:abstractNum w:abstractNumId="50" w15:restartNumberingAfterBreak="0">
+  <w:abstractNum w:abstractNumId="53" w15:restartNumberingAfterBreak="0">
     <w:nsid w:val="6E5D3836"/>
     <w:multiLevelType w:val="multilevel"/>
     <w:tmpl w:val="3ABA4934"/>
@@ -75685,7 +76103,7 @@
       </w:rPr>
     </w:lvl>
   </w:abstractNum>
-  <w:abstractNum w:abstractNumId="51" w15:restartNumberingAfterBreak="0">
+  <w:abstractNum w:abstractNumId="54" w15:restartNumberingAfterBreak="0">
     <w:nsid w:val="719B0920"/>
     <w:multiLevelType w:val="multilevel"/>
     <w:tmpl w:val="995C05C2"/>
@@ -75834,7 +76252,7 @@
       </w:rPr>
     </w:lvl>
   </w:abstractNum>
-  <w:abstractNum w:abstractNumId="52" w15:restartNumberingAfterBreak="0">
+  <w:abstractNum w:abstractNumId="55" w15:restartNumberingAfterBreak="0">
     <w:nsid w:val="72FF6066"/>
     <w:multiLevelType w:val="multilevel"/>
     <w:tmpl w:val="DC400B54"/>
@@ -75983,7 +76401,7 @@
       </w:rPr>
     </w:lvl>
   </w:abstractNum>
-  <w:abstractNum w:abstractNumId="53" w15:restartNumberingAfterBreak="0">
+  <w:abstractNum w:abstractNumId="56" w15:restartNumberingAfterBreak="0">
     <w:nsid w:val="73154F35"/>
     <w:multiLevelType w:val="multilevel"/>
     <w:tmpl w:val="BE0EC726"/>
@@ -76132,7 +76550,7 @@
       </w:rPr>
     </w:lvl>
   </w:abstractNum>
-  <w:abstractNum w:abstractNumId="54" w15:restartNumberingAfterBreak="0">
+  <w:abstractNum w:abstractNumId="57" w15:restartNumberingAfterBreak="0">
     <w:nsid w:val="733514FD"/>
     <w:multiLevelType w:val="multilevel"/>
     <w:tmpl w:val="E8EE824E"/>
@@ -76281,7 +76699,7 @@
       </w:rPr>
     </w:lvl>
   </w:abstractNum>
-  <w:abstractNum w:abstractNumId="55" w15:restartNumberingAfterBreak="0">
+  <w:abstractNum w:abstractNumId="58" w15:restartNumberingAfterBreak="0">
     <w:nsid w:val="73E60870"/>
     <w:multiLevelType w:val="multilevel"/>
     <w:tmpl w:val="A8900D8E"/>
@@ -76430,7 +76848,7 @@
       </w:rPr>
     </w:lvl>
   </w:abstractNum>
-  <w:abstractNum w:abstractNumId="56" w15:restartNumberingAfterBreak="0">
+  <w:abstractNum w:abstractNumId="59" w15:restartNumberingAfterBreak="0">
     <w:nsid w:val="75BF7F05"/>
     <w:multiLevelType w:val="hybridMultilevel"/>
     <w:tmpl w:val="6D12BAB4"/>
@@ -76546,7 +76964,7 @@
       </w:rPr>
     </w:lvl>
   </w:abstractNum>
-  <w:abstractNum w:abstractNumId="57" w15:restartNumberingAfterBreak="0">
+  <w:abstractNum w:abstractNumId="60" w15:restartNumberingAfterBreak="0">
     <w:nsid w:val="76F315EE"/>
     <w:multiLevelType w:val="multilevel"/>
     <w:tmpl w:val="1C0A14E8"/>
@@ -76695,7 +77113,7 @@
       </w:rPr>
     </w:lvl>
   </w:abstractNum>
-  <w:abstractNum w:abstractNumId="58" w15:restartNumberingAfterBreak="0">
+  <w:abstractNum w:abstractNumId="61" w15:restartNumberingAfterBreak="0">
     <w:nsid w:val="79672A67"/>
     <w:multiLevelType w:val="multilevel"/>
     <w:tmpl w:val="B3A8D180"/>
@@ -76844,7 +77262,7 @@
       </w:rPr>
     </w:lvl>
   </w:abstractNum>
-  <w:abstractNum w:abstractNumId="59" w15:restartNumberingAfterBreak="0">
+  <w:abstractNum w:abstractNumId="62" w15:restartNumberingAfterBreak="0">
     <w:nsid w:val="79FB6079"/>
     <w:multiLevelType w:val="multilevel"/>
     <w:tmpl w:val="87EE49E8"/>
@@ -76993,7 +77411,7 @@
       </w:rPr>
     </w:lvl>
   </w:abstractNum>
-  <w:abstractNum w:abstractNumId="60" w15:restartNumberingAfterBreak="0">
+  <w:abstractNum w:abstractNumId="63" w15:restartNumberingAfterBreak="0">
     <w:nsid w:val="7B25198C"/>
     <w:multiLevelType w:val="multilevel"/>
     <w:tmpl w:val="737CFDF4"/>
@@ -77142,7 +77560,7 @@
       </w:rPr>
     </w:lvl>
   </w:abstractNum>
-  <w:abstractNum w:abstractNumId="61" w15:restartNumberingAfterBreak="0">
+  <w:abstractNum w:abstractNumId="64" w15:restartNumberingAfterBreak="0">
     <w:nsid w:val="7C8718D4"/>
     <w:multiLevelType w:val="multilevel"/>
     <w:tmpl w:val="D5CA5210"/>
@@ -77288,181 +77706,181 @@
     </w:lvl>
   </w:abstractNum>
   <w:num w:numId="1" w16cid:durableId="803547330">
+    <w:abstractNumId w:val="2"/>
+  </w:num>
+  <w:num w:numId="2" w16cid:durableId="996416514">
+    <w:abstractNumId w:val="52"/>
+  </w:num>
+  <w:num w:numId="3" w16cid:durableId="1420760491">
+    <w:abstractNumId w:val="22"/>
+  </w:num>
+  <w:num w:numId="4" w16cid:durableId="195850360">
+    <w:abstractNumId w:val="55"/>
+  </w:num>
+  <w:num w:numId="5" w16cid:durableId="1735734749">
+    <w:abstractNumId w:val="61"/>
+  </w:num>
+  <w:num w:numId="6" w16cid:durableId="882448359">
+    <w:abstractNumId w:val="16"/>
+  </w:num>
+  <w:num w:numId="7" w16cid:durableId="1088117680">
+    <w:abstractNumId w:val="24"/>
+  </w:num>
+  <w:num w:numId="8" w16cid:durableId="367535439">
+    <w:abstractNumId w:val="30"/>
+  </w:num>
+  <w:num w:numId="9" w16cid:durableId="1603342724">
+    <w:abstractNumId w:val="53"/>
+  </w:num>
+  <w:num w:numId="10" w16cid:durableId="1566062461">
+    <w:abstractNumId w:val="17"/>
+  </w:num>
+  <w:num w:numId="11" w16cid:durableId="675956627">
+    <w:abstractNumId w:val="50"/>
+  </w:num>
+  <w:num w:numId="12" w16cid:durableId="1244796601">
+    <w:abstractNumId w:val="5"/>
+  </w:num>
+  <w:num w:numId="13" w16cid:durableId="601648954">
+    <w:abstractNumId w:val="51"/>
+  </w:num>
+  <w:num w:numId="14" w16cid:durableId="1787235191">
+    <w:abstractNumId w:val="40"/>
+  </w:num>
+  <w:num w:numId="15" w16cid:durableId="193008388">
+    <w:abstractNumId w:val="3"/>
+  </w:num>
+  <w:num w:numId="16" w16cid:durableId="611128909">
+    <w:abstractNumId w:val="35"/>
+  </w:num>
+  <w:num w:numId="17" w16cid:durableId="431974326">
+    <w:abstractNumId w:val="34"/>
+  </w:num>
+  <w:num w:numId="18" w16cid:durableId="1216546127">
+    <w:abstractNumId w:val="6"/>
+  </w:num>
+  <w:num w:numId="19" w16cid:durableId="1563103907">
+    <w:abstractNumId w:val="38"/>
+  </w:num>
+  <w:num w:numId="20" w16cid:durableId="1353411481">
+    <w:abstractNumId w:val="18"/>
+  </w:num>
+  <w:num w:numId="21" w16cid:durableId="1243375073">
+    <w:abstractNumId w:val="11"/>
+  </w:num>
+  <w:num w:numId="22" w16cid:durableId="714810783">
+    <w:abstractNumId w:val="32"/>
+  </w:num>
+  <w:num w:numId="23" w16cid:durableId="506671522">
+    <w:abstractNumId w:val="63"/>
+  </w:num>
+  <w:num w:numId="24" w16cid:durableId="1446919736">
+    <w:abstractNumId w:val="49"/>
+  </w:num>
+  <w:num w:numId="25" w16cid:durableId="1233392568">
+    <w:abstractNumId w:val="27"/>
+  </w:num>
+  <w:num w:numId="26" w16cid:durableId="569736065">
+    <w:abstractNumId w:val="26"/>
+  </w:num>
+  <w:num w:numId="27" w16cid:durableId="1509101177">
+    <w:abstractNumId w:val="47"/>
+  </w:num>
+  <w:num w:numId="28" w16cid:durableId="1754005780">
+    <w:abstractNumId w:val="46"/>
+  </w:num>
+  <w:num w:numId="29" w16cid:durableId="325482145">
+    <w:abstractNumId w:val="7"/>
+  </w:num>
+  <w:num w:numId="30" w16cid:durableId="1640766803">
+    <w:abstractNumId w:val="62"/>
+  </w:num>
+  <w:num w:numId="31" w16cid:durableId="460542203">
+    <w:abstractNumId w:val="36"/>
+  </w:num>
+  <w:num w:numId="32" w16cid:durableId="1547528727">
+    <w:abstractNumId w:val="56"/>
+  </w:num>
+  <w:num w:numId="33" w16cid:durableId="1713798682">
+    <w:abstractNumId w:val="41"/>
+  </w:num>
+  <w:num w:numId="34" w16cid:durableId="1693336390">
+    <w:abstractNumId w:val="8"/>
+  </w:num>
+  <w:num w:numId="35" w16cid:durableId="1793014308">
+    <w:abstractNumId w:val="14"/>
+  </w:num>
+  <w:num w:numId="36" w16cid:durableId="200827192">
+    <w:abstractNumId w:val="33"/>
+  </w:num>
+  <w:num w:numId="37" w16cid:durableId="298995977">
+    <w:abstractNumId w:val="54"/>
+  </w:num>
+  <w:num w:numId="38" w16cid:durableId="34811913">
+    <w:abstractNumId w:val="15"/>
+  </w:num>
+  <w:num w:numId="39" w16cid:durableId="1335647412">
+    <w:abstractNumId w:val="4"/>
+  </w:num>
+  <w:num w:numId="40" w16cid:durableId="1485588545">
+    <w:abstractNumId w:val="19"/>
+  </w:num>
+  <w:num w:numId="41" w16cid:durableId="1460418043">
+    <w:abstractNumId w:val="31"/>
+  </w:num>
+  <w:num w:numId="42" w16cid:durableId="2108575429">
+    <w:abstractNumId w:val="13"/>
+  </w:num>
+  <w:num w:numId="43" w16cid:durableId="891694356">
+    <w:abstractNumId w:val="29"/>
+  </w:num>
+  <w:num w:numId="44" w16cid:durableId="1191382789">
+    <w:abstractNumId w:val="9"/>
+  </w:num>
+  <w:num w:numId="45" w16cid:durableId="81142993">
+    <w:abstractNumId w:val="48"/>
+  </w:num>
+  <w:num w:numId="46" w16cid:durableId="982660417">
+    <w:abstractNumId w:val="20"/>
+  </w:num>
+  <w:num w:numId="47" w16cid:durableId="651565249">
+    <w:abstractNumId w:val="23"/>
+  </w:num>
+  <w:num w:numId="48" w16cid:durableId="321198445">
+    <w:abstractNumId w:val="45"/>
+  </w:num>
+  <w:num w:numId="49" w16cid:durableId="828401499">
+    <w:abstractNumId w:val="21"/>
+  </w:num>
+  <w:num w:numId="50" w16cid:durableId="761296323">
+    <w:abstractNumId w:val="44"/>
+  </w:num>
+  <w:num w:numId="51" w16cid:durableId="1399552658">
     <w:abstractNumId w:val="1"/>
   </w:num>
-  <w:num w:numId="2" w16cid:durableId="996416514">
-    <w:abstractNumId w:val="49"/>
-  </w:num>
-  <w:num w:numId="3" w16cid:durableId="1420760491">
-    <w:abstractNumId w:val="21"/>
-  </w:num>
-  <w:num w:numId="4" w16cid:durableId="195850360">
-    <w:abstractNumId w:val="52"/>
-  </w:num>
-  <w:num w:numId="5" w16cid:durableId="1735734749">
+  <w:num w:numId="52" w16cid:durableId="800265650">
     <w:abstractNumId w:val="58"/>
   </w:num>
-  <w:num w:numId="6" w16cid:durableId="882448359">
-    <w:abstractNumId w:val="15"/>
+  <w:num w:numId="53" w16cid:durableId="1034187255">
+    <w:abstractNumId w:val="57"/>
   </w:num>
-  <w:num w:numId="7" w16cid:durableId="1088117680">
-    <w:abstractNumId w:val="23"/>
+  <w:num w:numId="54" w16cid:durableId="1853950822">
+    <w:abstractNumId w:val="43"/>
   </w:num>
-  <w:num w:numId="8" w16cid:durableId="367535439">
-    <w:abstractNumId w:val="28"/>
+  <w:num w:numId="55" w16cid:durableId="681012227">
+    <w:abstractNumId w:val="60"/>
   </w:num>
-  <w:num w:numId="9" w16cid:durableId="1603342724">
-    <w:abstractNumId w:val="50"/>
+  <w:num w:numId="56" w16cid:durableId="875770689">
+    <w:abstractNumId w:val="64"/>
   </w:num>
-  <w:num w:numId="10" w16cid:durableId="1566062461">
-    <w:abstractNumId w:val="16"/>
-  </w:num>
-  <w:num w:numId="11" w16cid:durableId="675956627">
-    <w:abstractNumId w:val="47"/>
-  </w:num>
-  <w:num w:numId="12" w16cid:durableId="1244796601">
-    <w:abstractNumId w:val="4"/>
-  </w:num>
-  <w:num w:numId="13" w16cid:durableId="601648954">
-    <w:abstractNumId w:val="48"/>
-  </w:num>
-  <w:num w:numId="14" w16cid:durableId="1787235191">
-    <w:abstractNumId w:val="38"/>
-  </w:num>
-  <w:num w:numId="15" w16cid:durableId="193008388">
-    <w:abstractNumId w:val="2"/>
-  </w:num>
-  <w:num w:numId="16" w16cid:durableId="611128909">
-    <w:abstractNumId w:val="33"/>
-  </w:num>
-  <w:num w:numId="17" w16cid:durableId="431974326">
-    <w:abstractNumId w:val="32"/>
-  </w:num>
-  <w:num w:numId="18" w16cid:durableId="1216546127">
-    <w:abstractNumId w:val="5"/>
-  </w:num>
-  <w:num w:numId="19" w16cid:durableId="1563103907">
-    <w:abstractNumId w:val="36"/>
-  </w:num>
-  <w:num w:numId="20" w16cid:durableId="1353411481">
-    <w:abstractNumId w:val="17"/>
-  </w:num>
-  <w:num w:numId="21" w16cid:durableId="1243375073">
+  <w:num w:numId="57" w16cid:durableId="181941421">
     <w:abstractNumId w:val="10"/>
   </w:num>
-  <w:num w:numId="22" w16cid:durableId="714810783">
-    <w:abstractNumId w:val="30"/>
-  </w:num>
-  <w:num w:numId="23" w16cid:durableId="506671522">
-    <w:abstractNumId w:val="60"/>
-  </w:num>
-  <w:num w:numId="24" w16cid:durableId="1446919736">
-    <w:abstractNumId w:val="46"/>
-  </w:num>
-  <w:num w:numId="25" w16cid:durableId="1233392568">
-    <w:abstractNumId w:val="25"/>
-  </w:num>
-  <w:num w:numId="26" w16cid:durableId="569736065">
-    <w:abstractNumId w:val="24"/>
-  </w:num>
-  <w:num w:numId="27" w16cid:durableId="1509101177">
-    <w:abstractNumId w:val="44"/>
-  </w:num>
-  <w:num w:numId="28" w16cid:durableId="1754005780">
-    <w:abstractNumId w:val="43"/>
-  </w:num>
-  <w:num w:numId="29" w16cid:durableId="325482145">
-    <w:abstractNumId w:val="6"/>
-  </w:num>
-  <w:num w:numId="30" w16cid:durableId="1640766803">
-    <w:abstractNumId w:val="59"/>
-  </w:num>
-  <w:num w:numId="31" w16cid:durableId="460542203">
-    <w:abstractNumId w:val="34"/>
-  </w:num>
-  <w:num w:numId="32" w16cid:durableId="1547528727">
-    <w:abstractNumId w:val="53"/>
-  </w:num>
-  <w:num w:numId="33" w16cid:durableId="1713798682">
-    <w:abstractNumId w:val="39"/>
-  </w:num>
-  <w:num w:numId="34" w16cid:durableId="1693336390">
-    <w:abstractNumId w:val="7"/>
-  </w:num>
-  <w:num w:numId="35" w16cid:durableId="1793014308">
-    <w:abstractNumId w:val="13"/>
-  </w:num>
-  <w:num w:numId="36" w16cid:durableId="200827192">
-    <w:abstractNumId w:val="31"/>
-  </w:num>
-  <w:num w:numId="37" w16cid:durableId="298995977">
-    <w:abstractNumId w:val="51"/>
-  </w:num>
-  <w:num w:numId="38" w16cid:durableId="34811913">
-    <w:abstractNumId w:val="14"/>
-  </w:num>
-  <w:num w:numId="39" w16cid:durableId="1335647412">
-    <w:abstractNumId w:val="3"/>
-  </w:num>
-  <w:num w:numId="40" w16cid:durableId="1485588545">
-    <w:abstractNumId w:val="18"/>
-  </w:num>
-  <w:num w:numId="41" w16cid:durableId="1460418043">
-    <w:abstractNumId w:val="29"/>
-  </w:num>
-  <w:num w:numId="42" w16cid:durableId="2108575429">
+  <w:num w:numId="58" w16cid:durableId="630595562">
     <w:abstractNumId w:val="12"/>
   </w:num>
-  <w:num w:numId="43" w16cid:durableId="891694356">
-    <w:abstractNumId w:val="27"/>
-  </w:num>
-  <w:num w:numId="44" w16cid:durableId="1191382789">
-    <w:abstractNumId w:val="8"/>
-  </w:num>
-  <w:num w:numId="45" w16cid:durableId="81142993">
-    <w:abstractNumId w:val="45"/>
-  </w:num>
-  <w:num w:numId="46" w16cid:durableId="982660417">
-    <w:abstractNumId w:val="19"/>
-  </w:num>
-  <w:num w:numId="47" w16cid:durableId="651565249">
-    <w:abstractNumId w:val="22"/>
-  </w:num>
-  <w:num w:numId="48" w16cid:durableId="321198445">
-    <w:abstractNumId w:val="42"/>
-  </w:num>
-  <w:num w:numId="49" w16cid:durableId="828401499">
-    <w:abstractNumId w:val="20"/>
-  </w:num>
-  <w:num w:numId="50" w16cid:durableId="761296323">
-    <w:abstractNumId w:val="41"/>
-  </w:num>
-  <w:num w:numId="51" w16cid:durableId="1399552658">
-    <w:abstractNumId w:val="0"/>
-  </w:num>
-  <w:num w:numId="52" w16cid:durableId="800265650">
-    <w:abstractNumId w:val="55"/>
-  </w:num>
-  <w:num w:numId="53" w16cid:durableId="1034187255">
-    <w:abstractNumId w:val="54"/>
-  </w:num>
-  <w:num w:numId="54" w16cid:durableId="1853950822">
-    <w:abstractNumId w:val="40"/>
-  </w:num>
-  <w:num w:numId="55" w16cid:durableId="681012227">
-    <w:abstractNumId w:val="57"/>
-  </w:num>
-  <w:num w:numId="56" w16cid:durableId="875770689">
-    <w:abstractNumId w:val="61"/>
-  </w:num>
-  <w:num w:numId="57" w16cid:durableId="181941421">
-    <w:abstractNumId w:val="9"/>
-  </w:num>
-  <w:num w:numId="58" w16cid:durableId="630595562">
-    <w:abstractNumId w:val="11"/>
-  </w:num>
   <w:num w:numId="59" w16cid:durableId="538511821">
-    <w:abstractNumId w:val="35"/>
+    <w:abstractNumId w:val="37"/>
     <w:lvlOverride w:ilvl="0"/>
     <w:lvlOverride w:ilvl="1"/>
     <w:lvlOverride w:ilvl="2"/>
@@ -77474,7 +77892,7 @@
     <w:lvlOverride w:ilvl="8"/>
   </w:num>
   <w:num w:numId="60" w16cid:durableId="130372449">
-    <w:abstractNumId w:val="37"/>
+    <w:abstractNumId w:val="39"/>
     <w:lvlOverride w:ilvl="0"/>
     <w:lvlOverride w:ilvl="1"/>
     <w:lvlOverride w:ilvl="2"/>
@@ -77486,7 +77904,7 @@
     <w:lvlOverride w:ilvl="8"/>
   </w:num>
   <w:num w:numId="61" w16cid:durableId="953830468">
-    <w:abstractNumId w:val="26"/>
+    <w:abstractNumId w:val="28"/>
     <w:lvlOverride w:ilvl="0"/>
     <w:lvlOverride w:ilvl="1"/>
     <w:lvlOverride w:ilvl="2"/>
@@ -77498,7 +77916,16 @@
     <w:lvlOverride w:ilvl="8"/>
   </w:num>
   <w:num w:numId="62" w16cid:durableId="1632444395">
-    <w:abstractNumId w:val="56"/>
+    <w:abstractNumId w:val="59"/>
+  </w:num>
+  <w:num w:numId="63" w16cid:durableId="585502964">
+    <w:abstractNumId w:val="0"/>
+  </w:num>
+  <w:num w:numId="64" w16cid:durableId="2001808982">
+    <w:abstractNumId w:val="42"/>
+  </w:num>
+  <w:num w:numId="65" w16cid:durableId="1376808611">
+    <w:abstractNumId w:val="25"/>
   </w:num>
 </w:numbering>
 </file>

</xml_diff>